<commit_message>
docs: preserve mundialista reference theme
</commit_message>
<xml_diff>
--- a/assets/documents/cv-exequiel-dearmas.docx
+++ b/assets/documents/cv-exequiel-dearmas.docx
@@ -12,15 +12,27 @@
           <w:lang w:val="es-AR"/>
         </w:rPr>
       </w:pPr>
-      <w:r>
-        <w:rPr>
-          <w:b/>
-          <w:bCs/>
-          <w:sz w:val="24"/>
-          <w:szCs w:val="24"/>
-          <w:lang w:val="es-AR"/>
-        </w:rPr>
-        <w:t>Curriculum Vitae</w:t>
+      <w:proofErr w:type="spellStart"/>
+      <w:r>
+        <w:rPr>
+          <w:b/>
+          <w:bCs/>
+          <w:sz w:val="24"/>
+          <w:szCs w:val="24"/>
+          <w:lang w:val="es-AR"/>
+        </w:rPr>
+        <w:t>Curriculum</w:t>
+      </w:r>
+      <w:proofErr w:type="spellEnd"/>
+      <w:r>
+        <w:rPr>
+          <w:b/>
+          <w:bCs/>
+          <w:sz w:val="24"/>
+          <w:szCs w:val="24"/>
+          <w:lang w:val="es-AR"/>
+        </w:rPr>
+        <w:t xml:space="preserve"> Vitae</w:t>
       </w:r>
     </w:p>
     <w:p>
@@ -63,43 +75,7 @@
           <w:szCs w:val="24"/>
           <w:lang w:val="es-AR"/>
         </w:rPr>
-        <w:t>Desarrollador Full Stack</w:t>
-      </w:r>
-      <w:r>
-        <w:rPr>
-          <w:b/>
-          <w:bCs/>
-          <w:i/>
-          <w:iCs/>
-          <w:sz w:val="24"/>
-          <w:szCs w:val="24"/>
-          <w:lang w:val="es-AR"/>
-        </w:rPr>
-        <w:t xml:space="preserve"> </w:t>
-      </w:r>
-      <w:r>
-        <w:rPr>
-          <w:b/>
-          <w:bCs/>
-          <w:i/>
-          <w:iCs/>
-          <w:sz w:val="24"/>
-          <w:szCs w:val="24"/>
-          <w:lang w:val="es-AR"/>
-        </w:rPr>
-        <w:t>| Análisis de Datos &amp; IA</w:t>
-      </w:r>
-      <w:r>
-        <w:rPr>
-          <w:b/>
-          <w:bCs/>
-          <w:i/>
-          <w:iCs/>
-          <w:sz w:val="24"/>
-          <w:szCs w:val="24"/>
-          <w:lang w:val="es-AR"/>
-        </w:rPr>
-        <w:t xml:space="preserve"> (En formación)</w:t>
+        <w:t>Desarrollador Full Stack en Formación | Análisis de Datos &amp; IA</w:t>
       </w:r>
       <w:r>
         <w:rPr>
@@ -320,154 +296,89 @@
           <w:lang w:val="es-AR"/>
         </w:rPr>
         <w:pict w14:anchorId="51906FC6">
+          <v:rect id="_x0000_i1025" style="width:0;height:.75pt" o:hralign="center" o:hrstd="t" o:hr="t" fillcolor="#a0a0a0" stroked="f"/>
+        </w:pict>
+      </w:r>
+    </w:p>
+    <w:p>
+      <w:pPr>
+        <w:rPr>
+          <w:b/>
+          <w:bCs/>
+          <w:sz w:val="24"/>
+          <w:szCs w:val="24"/>
+          <w:lang w:val="es-AR"/>
+        </w:rPr>
+      </w:pPr>
+      <w:r>
+        <w:rPr>
+          <w:b/>
+          <w:bCs/>
+          <w:sz w:val="24"/>
+          <w:szCs w:val="24"/>
+          <w:lang w:val="es-AR"/>
+        </w:rPr>
+        <w:t>Perfil Profesional</w:t>
+      </w:r>
+      <w:r>
+        <w:rPr>
+          <w:b/>
+          <w:bCs/>
+          <w:sz w:val="24"/>
+          <w:szCs w:val="24"/>
+          <w:lang w:val="es-AR"/>
+        </w:rPr>
+        <w:br/>
+        <w:t xml:space="preserve">Persona proactiva y con gran capacidad de aprendizaje en transición hacia el sector tecnológico. Con sólida experiencia en entornos comerciales de alta demanda, desarrollo habilidades de resolución de problemas, trabajo en equipo y atención al cliente. Actualmente enfocado en adquirir competencias técnicas en desarrollo web full </w:t>
+      </w:r>
+      <w:proofErr w:type="spellStart"/>
+      <w:r>
+        <w:rPr>
+          <w:b/>
+          <w:bCs/>
+          <w:sz w:val="24"/>
+          <w:szCs w:val="24"/>
+          <w:lang w:val="es-AR"/>
+        </w:rPr>
+        <w:t>stack</w:t>
+      </w:r>
+      <w:proofErr w:type="spellEnd"/>
+      <w:r>
+        <w:rPr>
+          <w:b/>
+          <w:bCs/>
+          <w:sz w:val="24"/>
+          <w:szCs w:val="24"/>
+          <w:lang w:val="es-AR"/>
+        </w:rPr>
+        <w:t>, análisis de datos e inteligencia artificial, con el objetivo de aportar valor en proyectos innovadores.</w:t>
+      </w:r>
+    </w:p>
+    <w:p>
+      <w:pPr>
+        <w:rPr>
+          <w:b/>
+          <w:bCs/>
+          <w:sz w:val="24"/>
+          <w:szCs w:val="24"/>
+          <w:lang w:val="es-AR"/>
+        </w:rPr>
+      </w:pPr>
+      <w:r>
+        <w:rPr>
+          <w:b/>
+          <w:bCs/>
+          <w:sz w:val="24"/>
+          <w:szCs w:val="24"/>
+          <w:lang w:val="es-AR"/>
+        </w:rPr>
+        <w:pict w14:anchorId="2D1CE49C">
           <v:rect id="_x0000_i1026" style="width:0;height:.75pt" o:hralign="center" o:hrstd="t" o:hr="t" fillcolor="#a0a0a0" stroked="f"/>
         </w:pict>
       </w:r>
     </w:p>
     <w:p>
       <w:pPr>
-        <w:rPr>
-          <w:b/>
-          <w:bCs/>
-          <w:sz w:val="24"/>
-          <w:szCs w:val="24"/>
-          <w:lang w:val="es-AR"/>
-        </w:rPr>
-      </w:pPr>
-      <w:r>
-        <w:rPr>
-          <w:b/>
-          <w:bCs/>
-          <w:sz w:val="24"/>
-          <w:szCs w:val="24"/>
-          <w:lang w:val="es-AR"/>
-        </w:rPr>
-        <w:t>Perfil profesional</w:t>
-      </w:r>
-      <w:r>
-        <w:rPr>
-          <w:b/>
-          <w:bCs/>
-          <w:sz w:val="24"/>
-          <w:szCs w:val="24"/>
-          <w:lang w:val="es-AR"/>
-        </w:rPr>
-        <w:br/>
-        <w:t>Estudiante avanzado de Sistemas con base en Python y experiencia en desarrollo web (React, Node.js, APIs, bases de datos). Me entusiasma la oportunidad de crecer como Desarrollador Python Junior, aplicando mis conocimientos en backend, servicios y flujos de trabajo Scrum.</w:t>
-      </w:r>
-    </w:p>
-    <w:p>
-      <w:pPr>
-        <w:rPr>
-          <w:b/>
-          <w:bCs/>
-          <w:sz w:val="24"/>
-          <w:szCs w:val="24"/>
-          <w:lang w:val="es-AR"/>
-        </w:rPr>
-      </w:pPr>
-      <w:r>
-        <w:rPr>
-          <w:b/>
-          <w:bCs/>
-          <w:sz w:val="24"/>
-          <w:szCs w:val="24"/>
-          <w:lang w:val="es-AR"/>
-        </w:rPr>
-        <w:t>Soy consciente de que aún me falta profundizar en algunas tecnologías (AWS, Docker, Angular, etc.), pero mi mayor fortaleza es aprender rápido y con autonomía. Busco activamente mi primera experiencia laboral en un equipo multidisciplinario, donde pueda aportar actitud resolutiva, compromiso con el cliente y muchas ganas de formarme.</w:t>
-      </w:r>
-    </w:p>
-    <w:p>
-      <w:pPr>
-        <w:rPr>
-          <w:b/>
-          <w:bCs/>
-          <w:sz w:val="24"/>
-          <w:szCs w:val="24"/>
-          <w:lang w:val="es-AR"/>
-        </w:rPr>
-      </w:pPr>
-      <w:r>
-        <w:rPr>
-          <w:b/>
-          <w:bCs/>
-          <w:sz w:val="24"/>
-          <w:szCs w:val="24"/>
-          <w:lang w:val="es-AR"/>
-        </w:rPr>
-        <w:t xml:space="preserve">Cuento con nivel de inglés </w:t>
-      </w:r>
-      <w:r>
-        <w:rPr>
-          <w:b/>
-          <w:bCs/>
-          <w:sz w:val="24"/>
-          <w:szCs w:val="24"/>
-          <w:lang w:val="es-AR"/>
-        </w:rPr>
-        <w:t>intermedio, el cual estoy en progreso de estudio mediante duolingo</w:t>
-      </w:r>
-      <w:r>
-        <w:rPr>
-          <w:b/>
-          <w:bCs/>
-          <w:sz w:val="24"/>
-          <w:szCs w:val="24"/>
-          <w:lang w:val="es-AR"/>
-        </w:rPr>
-        <w:t xml:space="preserve">, manejo de GitHub y conocimiento </w:t>
-      </w:r>
-      <w:r>
-        <w:rPr>
-          <w:b/>
-          <w:bCs/>
-          <w:sz w:val="24"/>
-          <w:szCs w:val="24"/>
-          <w:lang w:val="es-AR"/>
-        </w:rPr>
-        <w:t>básicos</w:t>
-      </w:r>
-      <w:r>
-        <w:rPr>
-          <w:b/>
-          <w:bCs/>
-          <w:sz w:val="24"/>
-          <w:szCs w:val="24"/>
-          <w:lang w:val="es-AR"/>
-        </w:rPr>
-        <w:t xml:space="preserve"> de PostgreSQL. Mi objetivo es crecer junto a la empresa, aprovechando su oferta de formación y mentoring.</w:t>
-      </w:r>
-    </w:p>
-    <w:p>
-      <w:pPr>
-        <w:rPr>
-          <w:b/>
-          <w:bCs/>
-          <w:sz w:val="24"/>
-          <w:szCs w:val="24"/>
-          <w:lang w:val="es-AR"/>
-        </w:rPr>
-      </w:pPr>
-    </w:p>
-    <w:p>
-      <w:pPr>
-        <w:pStyle w:val="Prrafodelista"/>
-        <w:numPr>
-          <w:ilvl w:val="0"/>
-          <w:numId w:val="6"/>
-        </w:numPr>
-        <w:rPr>
-          <w:b/>
-          <w:bCs/>
-          <w:sz w:val="24"/>
-          <w:szCs w:val="24"/>
-          <w:lang w:val="es-AR"/>
-        </w:rPr>
-      </w:pPr>
-    </w:p>
-    <w:p>
-      <w:pPr>
-        <w:pStyle w:val="Prrafodelista"/>
         <w:rPr>
           <w:b/>
           <w:bCs/>
@@ -559,159 +470,29 @@
           <w:szCs w:val="24"/>
           <w:lang w:val="es-AR"/>
         </w:rPr>
-        <w:t>Carrera de Desarrollo Full Stack – CoderHouse (</w:t>
-      </w:r>
-      <w:r>
-        <w:rPr>
-          <w:b/>
-          <w:bCs/>
-          <w:sz w:val="24"/>
-          <w:szCs w:val="24"/>
-          <w:lang w:val="es-AR"/>
-        </w:rPr>
-        <w:t>Completa</w:t>
-      </w:r>
-      <w:r>
-        <w:rPr>
-          <w:b/>
-          <w:bCs/>
-          <w:sz w:val="24"/>
-          <w:szCs w:val="24"/>
-          <w:lang w:val="es-AR"/>
-        </w:rPr>
-        <w:t>).</w:t>
-      </w:r>
-    </w:p>
-    <w:p>
-      <w:pPr>
-        <w:ind w:left="1440"/>
-        <w:rPr>
-          <w:b/>
-          <w:bCs/>
-          <w:sz w:val="24"/>
-          <w:szCs w:val="24"/>
-          <w:lang w:val="es-AR"/>
-        </w:rPr>
-      </w:pPr>
-      <w:r>
-        <w:rPr>
-          <w:b/>
-          <w:bCs/>
-          <w:sz w:val="24"/>
-          <w:szCs w:val="24"/>
-          <w:lang w:val="es-AR"/>
-        </w:rPr>
-        <w:t>Desarrollo Web</w:t>
-      </w:r>
-      <w:r>
-        <w:rPr>
-          <w:b/>
-          <w:bCs/>
-          <w:sz w:val="24"/>
-          <w:szCs w:val="24"/>
-          <w:lang w:val="es-AR"/>
-        </w:rPr>
-        <w:t xml:space="preserve"> – JavaScript – React JS </w:t>
-      </w:r>
-      <w:r>
-        <w:rPr>
-          <w:b/>
-          <w:bCs/>
-          <w:sz w:val="24"/>
-          <w:szCs w:val="24"/>
-          <w:lang w:val="es-AR"/>
-        </w:rPr>
-        <w:t>–</w:t>
-      </w:r>
-      <w:r>
-        <w:rPr>
-          <w:b/>
-          <w:bCs/>
-          <w:sz w:val="24"/>
-          <w:szCs w:val="24"/>
-          <w:lang w:val="es-AR"/>
-        </w:rPr>
-        <w:t xml:space="preserve"> </w:t>
-      </w:r>
-      <w:r>
-        <w:rPr>
-          <w:b/>
-          <w:bCs/>
-          <w:sz w:val="24"/>
-          <w:szCs w:val="24"/>
-          <w:lang w:val="es-AR"/>
-        </w:rPr>
-        <w:t>Backend I (</w:t>
-      </w:r>
-      <w:r>
-        <w:rPr>
-          <w:b/>
-          <w:bCs/>
-          <w:sz w:val="24"/>
-          <w:szCs w:val="24"/>
-          <w:lang w:val="es-AR"/>
-        </w:rPr>
-        <w:t>Desarrollo avanzado de Backend)</w:t>
-      </w:r>
-      <w:r>
-        <w:rPr>
-          <w:b/>
-          <w:bCs/>
-          <w:sz w:val="24"/>
-          <w:szCs w:val="24"/>
-          <w:lang w:val="es-AR"/>
-        </w:rPr>
-        <w:t>, II</w:t>
-      </w:r>
-      <w:r>
-        <w:rPr>
-          <w:b/>
-          <w:bCs/>
-          <w:sz w:val="24"/>
-          <w:szCs w:val="24"/>
-          <w:lang w:val="es-AR"/>
-        </w:rPr>
-        <w:t xml:space="preserve"> (</w:t>
-      </w:r>
-      <w:r>
-        <w:rPr>
-          <w:b/>
-          <w:bCs/>
-          <w:sz w:val="24"/>
-          <w:szCs w:val="24"/>
-          <w:lang w:val="es-AR"/>
-        </w:rPr>
-        <w:t>Diseño y Arquitectura)</w:t>
-      </w:r>
-      <w:r>
-        <w:rPr>
-          <w:b/>
-          <w:bCs/>
-          <w:sz w:val="24"/>
-          <w:szCs w:val="24"/>
-          <w:lang w:val="es-AR"/>
-        </w:rPr>
-        <w:t>, III</w:t>
-      </w:r>
-      <w:r>
-        <w:rPr>
-          <w:b/>
-          <w:bCs/>
-          <w:sz w:val="24"/>
-          <w:szCs w:val="24"/>
-          <w:lang w:val="es-AR"/>
-        </w:rPr>
-        <w:t xml:space="preserve"> </w:t>
-      </w:r>
-      <w:r>
-        <w:rPr>
-          <w:b/>
-          <w:bCs/>
-          <w:sz w:val="24"/>
-          <w:szCs w:val="24"/>
-          <w:lang w:val="es-AR"/>
-        </w:rPr>
-        <w:t>(Testing y Escabilidad Flex).</w:t>
+        <w:t xml:space="preserve">Carrera de Desarrollo Full Stack – </w:t>
+      </w:r>
+      <w:proofErr w:type="spellStart"/>
+      <w:r>
+        <w:rPr>
+          <w:b/>
+          <w:bCs/>
+          <w:sz w:val="24"/>
+          <w:szCs w:val="24"/>
+          <w:lang w:val="es-AR"/>
+        </w:rPr>
+        <w:t>CoderHouse</w:t>
+      </w:r>
+      <w:proofErr w:type="spellEnd"/>
+      <w:r>
+        <w:rPr>
+          <w:b/>
+          <w:bCs/>
+          <w:sz w:val="24"/>
+          <w:szCs w:val="24"/>
+          <w:lang w:val="es-AR"/>
+        </w:rPr>
+        <w:t>.</w:t>
       </w:r>
     </w:p>
     <w:p>
@@ -832,7 +613,29 @@
           <w:szCs w:val="24"/>
           <w:lang w:val="es-AR"/>
         </w:rPr>
-        <w:t>Python (Nivel 1 y 2) – Udemy / LinkedIn Learning.</w:t>
+        <w:t xml:space="preserve">Python (Nivel 1 y 2) – Udemy / LinkedIn </w:t>
+      </w:r>
+      <w:proofErr w:type="spellStart"/>
+      <w:r>
+        <w:rPr>
+          <w:b/>
+          <w:bCs/>
+          <w:sz w:val="24"/>
+          <w:szCs w:val="24"/>
+          <w:lang w:val="es-AR"/>
+        </w:rPr>
+        <w:t>Learning</w:t>
+      </w:r>
+      <w:proofErr w:type="spellEnd"/>
+      <w:r>
+        <w:rPr>
+          <w:b/>
+          <w:bCs/>
+          <w:sz w:val="24"/>
+          <w:szCs w:val="24"/>
+          <w:lang w:val="es-AR"/>
+        </w:rPr>
+        <w:t>.</w:t>
       </w:r>
     </w:p>
     <w:p>
@@ -857,7 +660,29 @@
           <w:szCs w:val="24"/>
           <w:lang w:val="es-AR"/>
         </w:rPr>
-        <w:t>Análisis de Datos – LinkedIn Learning.</w:t>
+        <w:t xml:space="preserve">Análisis de Datos – LinkedIn </w:t>
+      </w:r>
+      <w:proofErr w:type="spellStart"/>
+      <w:r>
+        <w:rPr>
+          <w:b/>
+          <w:bCs/>
+          <w:sz w:val="24"/>
+          <w:szCs w:val="24"/>
+          <w:lang w:val="es-AR"/>
+        </w:rPr>
+        <w:t>Learning</w:t>
+      </w:r>
+      <w:proofErr w:type="spellEnd"/>
+      <w:r>
+        <w:rPr>
+          <w:b/>
+          <w:bCs/>
+          <w:sz w:val="24"/>
+          <w:szCs w:val="24"/>
+          <w:lang w:val="es-AR"/>
+        </w:rPr>
+        <w:t>.</w:t>
       </w:r>
     </w:p>
     <w:p>
@@ -882,7 +707,29 @@
           <w:szCs w:val="24"/>
           <w:lang w:val="es-AR"/>
         </w:rPr>
-        <w:t>Power BI Esencial – LinkedIn Learning.</w:t>
+        <w:t xml:space="preserve">Power BI Esencial – LinkedIn </w:t>
+      </w:r>
+      <w:proofErr w:type="spellStart"/>
+      <w:r>
+        <w:rPr>
+          <w:b/>
+          <w:bCs/>
+          <w:sz w:val="24"/>
+          <w:szCs w:val="24"/>
+          <w:lang w:val="es-AR"/>
+        </w:rPr>
+        <w:t>Learning</w:t>
+      </w:r>
+      <w:proofErr w:type="spellEnd"/>
+      <w:r>
+        <w:rPr>
+          <w:b/>
+          <w:bCs/>
+          <w:sz w:val="24"/>
+          <w:szCs w:val="24"/>
+          <w:lang w:val="es-AR"/>
+        </w:rPr>
+        <w:t>.</w:t>
       </w:r>
     </w:p>
     <w:p>
@@ -982,7 +829,6 @@
           <w:szCs w:val="24"/>
           <w:lang w:val="es-AR"/>
         </w:rPr>
-        <w:lastRenderedPageBreak/>
         <w:t>Marketing Digital &amp; Negocios:</w:t>
       </w:r>
     </w:p>
@@ -1108,27 +954,50 @@
           <w:szCs w:val="24"/>
           <w:lang w:val="es-AR"/>
         </w:rPr>
-        <w:t>Fundamentos del Personal Branding – LinkedIn Learning.</w:t>
-      </w:r>
-    </w:p>
-    <w:p>
-      <w:pPr>
-        <w:rPr>
-          <w:b/>
-          <w:bCs/>
-          <w:sz w:val="24"/>
-          <w:szCs w:val="24"/>
-          <w:lang w:val="es-AR"/>
-        </w:rPr>
-      </w:pPr>
-      <w:r>
-        <w:rPr>
-          <w:b/>
-          <w:bCs/>
-          <w:sz w:val="24"/>
-          <w:szCs w:val="24"/>
-          <w:lang w:val="es-AR"/>
-        </w:rPr>
+        <w:t xml:space="preserve">Fundamentos del Personal Branding – LinkedIn </w:t>
+      </w:r>
+      <w:proofErr w:type="spellStart"/>
+      <w:r>
+        <w:rPr>
+          <w:b/>
+          <w:bCs/>
+          <w:sz w:val="24"/>
+          <w:szCs w:val="24"/>
+          <w:lang w:val="es-AR"/>
+        </w:rPr>
+        <w:t>Learning</w:t>
+      </w:r>
+      <w:proofErr w:type="spellEnd"/>
+      <w:r>
+        <w:rPr>
+          <w:b/>
+          <w:bCs/>
+          <w:sz w:val="24"/>
+          <w:szCs w:val="24"/>
+          <w:lang w:val="es-AR"/>
+        </w:rPr>
+        <w:t>.</w:t>
+      </w:r>
+    </w:p>
+    <w:p>
+      <w:pPr>
+        <w:rPr>
+          <w:b/>
+          <w:bCs/>
+          <w:sz w:val="24"/>
+          <w:szCs w:val="24"/>
+          <w:lang w:val="es-AR"/>
+        </w:rPr>
+      </w:pPr>
+      <w:r>
+        <w:rPr>
+          <w:b/>
+          <w:bCs/>
+          <w:sz w:val="24"/>
+          <w:szCs w:val="24"/>
+          <w:lang w:val="es-AR"/>
+        </w:rPr>
+        <w:lastRenderedPageBreak/>
         <w:t>Habilidades Técnicas</w:t>
       </w:r>
     </w:p>
@@ -1154,7 +1023,29 @@
           <w:szCs w:val="24"/>
           <w:lang w:val="es-AR"/>
         </w:rPr>
-        <w:t>Lenguajes/Frameworks: Python (Básico).</w:t>
+        <w:t>Lenguajes/</w:t>
+      </w:r>
+      <w:proofErr w:type="spellStart"/>
+      <w:r>
+        <w:rPr>
+          <w:b/>
+          <w:bCs/>
+          <w:sz w:val="24"/>
+          <w:szCs w:val="24"/>
+          <w:lang w:val="es-AR"/>
+        </w:rPr>
+        <w:t>Frameworks</w:t>
+      </w:r>
+      <w:proofErr w:type="spellEnd"/>
+      <w:r>
+        <w:rPr>
+          <w:b/>
+          <w:bCs/>
+          <w:sz w:val="24"/>
+          <w:szCs w:val="24"/>
+          <w:lang w:val="es-AR"/>
+        </w:rPr>
+        <w:t>: Python (Básico).</w:t>
       </w:r>
     </w:p>
     <w:p>
@@ -1204,7 +1095,29 @@
           <w:szCs w:val="24"/>
           <w:lang w:val="es-AR"/>
         </w:rPr>
-        <w:t>Desarrollo Web: HTML, CSS, JavaScript (Fundamentos, en formación full stack).</w:t>
+        <w:t xml:space="preserve">Desarrollo Web: HTML, CSS, JavaScript (Fundamentos, en formación full </w:t>
+      </w:r>
+      <w:proofErr w:type="spellStart"/>
+      <w:r>
+        <w:rPr>
+          <w:b/>
+          <w:bCs/>
+          <w:sz w:val="24"/>
+          <w:szCs w:val="24"/>
+          <w:lang w:val="es-AR"/>
+        </w:rPr>
+        <w:t>stack</w:t>
+      </w:r>
+      <w:proofErr w:type="spellEnd"/>
+      <w:r>
+        <w:rPr>
+          <w:b/>
+          <w:bCs/>
+          <w:sz w:val="24"/>
+          <w:szCs w:val="24"/>
+          <w:lang w:val="es-AR"/>
+        </w:rPr>
+        <w:t>).</w:t>
       </w:r>
     </w:p>
     <w:p>
@@ -1408,153 +1321,7 @@
 
 <file path=word/numbering.xml><?xml version="1.0" encoding="utf-8"?>
 <w:numbering xmlns:wpc="http://schemas.microsoft.com/office/word/2010/wordprocessingCanvas" xmlns:cx="http://schemas.microsoft.com/office/drawing/2014/chartex" xmlns:cx1="http://schemas.microsoft.com/office/drawing/2015/9/8/chartex" xmlns:cx2="http://schemas.microsoft.com/office/drawing/2015/10/21/chartex" xmlns:cx3="http://schemas.microsoft.com/office/drawing/2016/5/9/chartex" xmlns:cx4="http://schemas.microsoft.com/office/drawing/2016/5/10/chartex" xmlns:cx5="http://schemas.microsoft.com/office/drawing/2016/5/11/chartex" xmlns:cx6="http://schemas.microsoft.com/office/drawing/2016/5/12/chartex" xmlns:cx7="http://schemas.microsoft.com/office/drawing/2016/5/13/chartex" xmlns:cx8="http://schemas.microsoft.com/office/drawing/2016/5/14/chartex" xmlns:mc="http://schemas.openxmlformats.org/markup-compatibility/2006" xmlns:aink="http://schemas.microsoft.com/office/drawing/2016/ink" xmlns:am3d="http://schemas.microsoft.com/office/drawing/2017/model3d" xmlns:o="urn:schemas-microsoft-com:office:office" xmlns:oel="http://schemas.microsoft.com/office/2019/extlst" xmlns:r="http://schemas.openxmlformats.org/officeDocument/2006/relationships" xmlns:m="http://schemas.openxmlformats.org/officeDocument/2006/math" xmlns:v="urn:schemas-microsoft-com:vml" xmlns:wp14="http://schemas.microsoft.com/office/word/2010/wordprocessingDrawing" xmlns:wp="http://schemas.openxmlformats.org/drawingml/2006/wordprocessingDrawing" xmlns:w10="urn:schemas-microsoft-com:office:word" xmlns:w="http://schemas.openxmlformats.org/wordprocessingml/2006/main" xmlns:w14="http://schemas.microsoft.com/office/word/2010/wordml" xmlns:w15="http://schemas.microsoft.com/office/word/2012/wordml" xmlns:w16cex="http://schemas.microsoft.com/office/word/2018/wordml/cex" xmlns:w16cid="http://schemas.microsoft.com/office/word/2016/wordml/cid" xmlns:w16="http://schemas.microsoft.com/office/word/2018/wordml" xmlns:w16du="http://schemas.microsoft.com/office/word/2023/wordml/word16du" xmlns:w16sdtdh="http://schemas.microsoft.com/office/word/2020/wordml/sdtdatahash" xmlns:w16sdtfl="http://schemas.microsoft.com/office/word/2024/wordml/sdtformatlock" xmlns:w16se="http://schemas.microsoft.com/office/word/2015/wordml/symex" xmlns:wpg="http://schemas.microsoft.com/office/word/2010/wordprocessingGroup" xmlns:wpi="http://schemas.microsoft.com/office/word/2010/wordprocessingInk" xmlns:wne="http://schemas.microsoft.com/office/word/2006/wordml" xmlns:wps="http://schemas.microsoft.com/office/word/2010/wordprocessingShape" mc:Ignorable="w14 w15 w16se w16cid w16 w16cex w16sdtdh w16sdtfl w16du wp14">
-  <w:numPicBullet w:numPicBulletId="0">
-    <w:pict>
-      <v:rect id="_x0000_i1025" style="width:0;height:.75pt" o:hralign="center" o:bullet="t" o:hrstd="t" o:hr="t" fillcolor="#a0a0a0" stroked="f"/>
-    </w:pict>
-  </w:numPicBullet>
   <w:abstractNum w:abstractNumId="0" w15:restartNumberingAfterBreak="0">
-    <w:nsid w:val="27C728D2"/>
-    <w:multiLevelType w:val="hybridMultilevel"/>
-    <w:tmpl w:val="87426298"/>
-    <w:lvl w:ilvl="0" w:tplc="F27ABAE4">
-      <w:start w:val="1"/>
-      <w:numFmt w:val="bullet"/>
-      <w:lvlText w:val=""/>
-      <w:lvlPicBulletId w:val="0"/>
-      <w:lvlJc w:val="left"/>
-      <w:pPr>
-        <w:tabs>
-          <w:tab w:val="num" w:pos="720"/>
-        </w:tabs>
-        <w:ind w:left="720" w:hanging="360"/>
-      </w:pPr>
-      <w:rPr>
-        <w:rFonts w:ascii="Symbol" w:hAnsi="Symbol" w:hint="default"/>
-      </w:rPr>
-    </w:lvl>
-    <w:lvl w:ilvl="1" w:tplc="63A41E5A" w:tentative="1">
-      <w:start w:val="1"/>
-      <w:numFmt w:val="bullet"/>
-      <w:lvlText w:val=""/>
-      <w:lvlJc w:val="left"/>
-      <w:pPr>
-        <w:tabs>
-          <w:tab w:val="num" w:pos="1440"/>
-        </w:tabs>
-        <w:ind w:left="1440" w:hanging="360"/>
-      </w:pPr>
-      <w:rPr>
-        <w:rFonts w:ascii="Symbol" w:hAnsi="Symbol" w:hint="default"/>
-      </w:rPr>
-    </w:lvl>
-    <w:lvl w:ilvl="2" w:tplc="D7CA00E2" w:tentative="1">
-      <w:start w:val="1"/>
-      <w:numFmt w:val="bullet"/>
-      <w:lvlText w:val=""/>
-      <w:lvlJc w:val="left"/>
-      <w:pPr>
-        <w:tabs>
-          <w:tab w:val="num" w:pos="2160"/>
-        </w:tabs>
-        <w:ind w:left="2160" w:hanging="360"/>
-      </w:pPr>
-      <w:rPr>
-        <w:rFonts w:ascii="Symbol" w:hAnsi="Symbol" w:hint="default"/>
-      </w:rPr>
-    </w:lvl>
-    <w:lvl w:ilvl="3" w:tplc="3C0635F2" w:tentative="1">
-      <w:start w:val="1"/>
-      <w:numFmt w:val="bullet"/>
-      <w:lvlText w:val=""/>
-      <w:lvlJc w:val="left"/>
-      <w:pPr>
-        <w:tabs>
-          <w:tab w:val="num" w:pos="2880"/>
-        </w:tabs>
-        <w:ind w:left="2880" w:hanging="360"/>
-      </w:pPr>
-      <w:rPr>
-        <w:rFonts w:ascii="Symbol" w:hAnsi="Symbol" w:hint="default"/>
-      </w:rPr>
-    </w:lvl>
-    <w:lvl w:ilvl="4" w:tplc="053E9DD8" w:tentative="1">
-      <w:start w:val="1"/>
-      <w:numFmt w:val="bullet"/>
-      <w:lvlText w:val=""/>
-      <w:lvlJc w:val="left"/>
-      <w:pPr>
-        <w:tabs>
-          <w:tab w:val="num" w:pos="3600"/>
-        </w:tabs>
-        <w:ind w:left="3600" w:hanging="360"/>
-      </w:pPr>
-      <w:rPr>
-        <w:rFonts w:ascii="Symbol" w:hAnsi="Symbol" w:hint="default"/>
-      </w:rPr>
-    </w:lvl>
-    <w:lvl w:ilvl="5" w:tplc="D958A61C" w:tentative="1">
-      <w:start w:val="1"/>
-      <w:numFmt w:val="bullet"/>
-      <w:lvlText w:val=""/>
-      <w:lvlJc w:val="left"/>
-      <w:pPr>
-        <w:tabs>
-          <w:tab w:val="num" w:pos="4320"/>
-        </w:tabs>
-        <w:ind w:left="4320" w:hanging="360"/>
-      </w:pPr>
-      <w:rPr>
-        <w:rFonts w:ascii="Symbol" w:hAnsi="Symbol" w:hint="default"/>
-      </w:rPr>
-    </w:lvl>
-    <w:lvl w:ilvl="6" w:tplc="2AA67F62" w:tentative="1">
-      <w:start w:val="1"/>
-      <w:numFmt w:val="bullet"/>
-      <w:lvlText w:val=""/>
-      <w:lvlJc w:val="left"/>
-      <w:pPr>
-        <w:tabs>
-          <w:tab w:val="num" w:pos="5040"/>
-        </w:tabs>
-        <w:ind w:left="5040" w:hanging="360"/>
-      </w:pPr>
-      <w:rPr>
-        <w:rFonts w:ascii="Symbol" w:hAnsi="Symbol" w:hint="default"/>
-      </w:rPr>
-    </w:lvl>
-    <w:lvl w:ilvl="7" w:tplc="46D483F0" w:tentative="1">
-      <w:start w:val="1"/>
-      <w:numFmt w:val="bullet"/>
-      <w:lvlText w:val=""/>
-      <w:lvlJc w:val="left"/>
-      <w:pPr>
-        <w:tabs>
-          <w:tab w:val="num" w:pos="5760"/>
-        </w:tabs>
-        <w:ind w:left="5760" w:hanging="360"/>
-      </w:pPr>
-      <w:rPr>
-        <w:rFonts w:ascii="Symbol" w:hAnsi="Symbol" w:hint="default"/>
-      </w:rPr>
-    </w:lvl>
-    <w:lvl w:ilvl="8" w:tplc="1C1CA156" w:tentative="1">
-      <w:start w:val="1"/>
-      <w:numFmt w:val="bullet"/>
-      <w:lvlText w:val=""/>
-      <w:lvlJc w:val="left"/>
-      <w:pPr>
-        <w:tabs>
-          <w:tab w:val="num" w:pos="6480"/>
-        </w:tabs>
-        <w:ind w:left="6480" w:hanging="360"/>
-      </w:pPr>
-      <w:rPr>
-        <w:rFonts w:ascii="Symbol" w:hAnsi="Symbol" w:hint="default"/>
-      </w:rPr>
-    </w:lvl>
-  </w:abstractNum>
-  <w:abstractNum w:abstractNumId="1" w15:restartNumberingAfterBreak="0">
     <w:nsid w:val="32E40A06"/>
     <w:multiLevelType w:val="multilevel"/>
     <w:tmpl w:val="59DE2356"/>
@@ -1703,7 +1470,7 @@
       </w:rPr>
     </w:lvl>
   </w:abstractNum>
-  <w:abstractNum w:abstractNumId="2" w15:restartNumberingAfterBreak="0">
+  <w:abstractNum w:abstractNumId="1" w15:restartNumberingAfterBreak="0">
     <w:nsid w:val="36B73BD7"/>
     <w:multiLevelType w:val="multilevel"/>
     <w:tmpl w:val="D372395C"/>
@@ -1852,7 +1619,7 @@
       </w:rPr>
     </w:lvl>
   </w:abstractNum>
-  <w:abstractNum w:abstractNumId="3" w15:restartNumberingAfterBreak="0">
+  <w:abstractNum w:abstractNumId="2" w15:restartNumberingAfterBreak="0">
     <w:nsid w:val="3A20215B"/>
     <w:multiLevelType w:val="multilevel"/>
     <w:tmpl w:val="9D08BCC2"/>
@@ -2001,7 +1768,7 @@
       </w:rPr>
     </w:lvl>
   </w:abstractNum>
-  <w:abstractNum w:abstractNumId="4" w15:restartNumberingAfterBreak="0">
+  <w:abstractNum w:abstractNumId="3" w15:restartNumberingAfterBreak="0">
     <w:nsid w:val="4CA81A5A"/>
     <w:multiLevelType w:val="multilevel"/>
     <w:tmpl w:val="3FBA3B04"/>
@@ -2150,7 +1917,7 @@
       </w:rPr>
     </w:lvl>
   </w:abstractNum>
-  <w:abstractNum w:abstractNumId="5" w15:restartNumberingAfterBreak="0">
+  <w:abstractNum w:abstractNumId="4" w15:restartNumberingAfterBreak="0">
     <w:nsid w:val="66354615"/>
     <w:multiLevelType w:val="multilevel"/>
     <w:tmpl w:val="981C04E6"/>
@@ -2300,22 +2067,19 @@
     </w:lvl>
   </w:abstractNum>
   <w:num w:numId="1" w16cid:durableId="1699358627">
+    <w:abstractNumId w:val="1"/>
+  </w:num>
+  <w:num w:numId="2" w16cid:durableId="949430742">
+    <w:abstractNumId w:val="3"/>
+  </w:num>
+  <w:num w:numId="3" w16cid:durableId="103841311">
     <w:abstractNumId w:val="2"/>
   </w:num>
-  <w:num w:numId="2" w16cid:durableId="949430742">
-    <w:abstractNumId w:val="4"/>
-  </w:num>
-  <w:num w:numId="3" w16cid:durableId="103841311">
-    <w:abstractNumId w:val="3"/>
-  </w:num>
   <w:num w:numId="4" w16cid:durableId="234240659">
-    <w:abstractNumId w:val="1"/>
+    <w:abstractNumId w:val="0"/>
   </w:num>
   <w:num w:numId="5" w16cid:durableId="758210479">
-    <w:abstractNumId w:val="5"/>
-  </w:num>
-  <w:num w:numId="6" w16cid:durableId="18245735">
-    <w:abstractNumId w:val="0"/>
+    <w:abstractNumId w:val="4"/>
   </w:num>
 </w:numbering>
 </file>
@@ -2741,28 +2505,6 @@
       <w:szCs w:val="26"/>
     </w:rPr>
   </w:style>
-  <w:style w:type="paragraph" w:styleId="Ttulo3">
-    <w:name w:val="heading 3"/>
-    <w:basedOn w:val="Normal"/>
-    <w:next w:val="Normal"/>
-    <w:link w:val="Ttulo3Car"/>
-    <w:uiPriority w:val="9"/>
-    <w:unhideWhenUsed/>
-    <w:qFormat/>
-    <w:rsid w:val="00576ECD"/>
-    <w:pPr>
-      <w:keepNext/>
-      <w:keepLines/>
-      <w:spacing w:before="40" w:after="0"/>
-      <w:outlineLvl w:val="2"/>
-    </w:pPr>
-    <w:rPr>
-      <w:rFonts w:asciiTheme="majorHAnsi" w:eastAsiaTheme="majorEastAsia" w:hAnsiTheme="majorHAnsi" w:cstheme="majorBidi"/>
-      <w:color w:val="1F3763" w:themeColor="accent1" w:themeShade="7F"/>
-      <w:sz w:val="24"/>
-      <w:szCs w:val="24"/>
-    </w:rPr>
-  </w:style>
   <w:style w:type="character" w:default="1" w:styleId="Fuentedeprrafopredeter">
     <w:name w:val="Default Paragraph Font"/>
     <w:uiPriority w:val="1"/>
@@ -2824,30 +2566,6 @@
     <w:rPr>
       <w:color w:val="605E5C"/>
       <w:shd w:val="clear" w:color="auto" w:fill="E1DFDD"/>
-    </w:rPr>
-  </w:style>
-  <w:style w:type="paragraph" w:styleId="Prrafodelista">
-    <w:name w:val="List Paragraph"/>
-    <w:basedOn w:val="Normal"/>
-    <w:uiPriority w:val="34"/>
-    <w:qFormat/>
-    <w:rsid w:val="0074212C"/>
-    <w:pPr>
-      <w:ind w:left="720"/>
-      <w:contextualSpacing/>
-    </w:pPr>
-  </w:style>
-  <w:style w:type="character" w:customStyle="1" w:styleId="Ttulo3Car">
-    <w:name w:val="Título 3 Car"/>
-    <w:basedOn w:val="Fuentedeprrafopredeter"/>
-    <w:link w:val="Ttulo3"/>
-    <w:uiPriority w:val="9"/>
-    <w:rsid w:val="00576ECD"/>
-    <w:rPr>
-      <w:rFonts w:asciiTheme="majorHAnsi" w:eastAsiaTheme="majorEastAsia" w:hAnsiTheme="majorHAnsi" w:cstheme="majorBidi"/>
-      <w:color w:val="1F3763" w:themeColor="accent1" w:themeShade="7F"/>
-      <w:sz w:val="24"/>
-      <w:szCs w:val="24"/>
     </w:rPr>
   </w:style>
 </w:styles>

</xml_diff>